<commit_message>
feat: enhance contract generation with new fields and Gotenberg PDF conversion
- Added new fields to StartCaseContractContext and CaseForContractRow for handling guarantors and refinanced loans.
- Introduced ContractGuarantorRow and RefinancedLoanRow interfaces for better data structure.
- Implemented GotenbergPdfConverter for converting DOCX to PDF with optional Basic Auth.
- Created tests for GotenbergPdfConverter to ensure proper functionality and error handling.
- Updated ContractPdfService to utilize GotenbergPdfConverter for PDF generation.
- Refactored template variable handling and added support for new contract types (MUTUO_CODEUDOR and REFINANCIACION).
- Added utility functions for converting numbers to Spanish words for contract amounts.
- Created tests for number-to-words utility functions to ensure accuracy.
</commit_message>
<xml_diff>
--- a/src/contracts/assets/Contrato_de_Mutuo_ZAGA_V1.docx
+++ b/src/contracts/assets/Contrato_de_Mutuo_ZAGA_V1.docx
@@ -74,7 +74,7 @@
           <w:highlight w:val="yellow"/>
           <w:rtl w:val="0"/>
         </w:rPr>
-        <w:t xml:space="preserve">[__]</w:t>
+        <w:t xml:space="preserve">{{DIA_FIRMA}}</w:t>
       </w:r>
       <w:r>
         <w:rPr>
@@ -93,7 +93,7 @@
           <w:highlight w:val="yellow"/>
           <w:rtl w:val="0"/>
         </w:rPr>
-        <w:t xml:space="preserve">[__]</w:t>
+        <w:t xml:space="preserve">{{MES_FIRMA}}</w:t>
       </w:r>
       <w:r>
         <w:rPr>
@@ -147,7 +147,7 @@
           <w:highlight w:val="yellow"/>
           <w:rtl w:val="0"/>
         </w:rPr>
-        <w:t xml:space="preserve">[__]</w:t>
+        <w:t xml:space="preserve">{{DOMICILIO_ZAGA}}</w:t>
       </w:r>
       <w:r>
         <w:rPr>
@@ -191,7 +191,7 @@
           <w:szCs w:val="24"/>
           <w:rtl w:val="0"/>
         </w:rPr>
-        <w:t xml:space="preserve">[Nombre y Apellido del Cliente], DNI </w:t>
+        <w:t xml:space="preserve">{{MUTUARIO_NOMBRE_COMPLETO}}, DNI </w:t>
       </w:r>
       <w:r>
         <w:rPr>
@@ -202,7 +202,7 @@
           <w:highlight w:val="yellow"/>
           <w:rtl w:val="0"/>
         </w:rPr>
-        <w:t xml:space="preserve">[__]</w:t>
+        <w:t xml:space="preserve">{{MUTUARIO_DNI}}</w:t>
       </w:r>
       <w:r>
         <w:rPr>
@@ -223,7 +223,7 @@
           <w:highlight w:val="yellow"/>
           <w:rtl w:val="0"/>
         </w:rPr>
-        <w:t xml:space="preserve">[__]</w:t>
+        <w:t xml:space="preserve">{{MUTUARIO_CUIT_CUIL}}</w:t>
       </w:r>
       <w:r>
         <w:rPr>
@@ -244,7 +244,7 @@
           <w:highlight w:val="yellow"/>
           <w:rtl w:val="0"/>
         </w:rPr>
-        <w:t xml:space="preserve">[__]</w:t>
+        <w:t xml:space="preserve">{{MUTUARIO_DOMICILIO}}</w:t>
       </w:r>
       <w:r>
         <w:rPr>
@@ -406,7 +406,7 @@
           <w:szCs w:val="24"/>
           <w:rtl w:val="0"/>
         </w:rPr>
-        <w:t xml:space="preserve">”), la suma de pesos [__] ($[__]) (en adelante, el “</w:t>
+        <w:t xml:space="preserve">”), la suma de pesos {{CAPITAL_PRESTADO_TEXTO}} (${{CAPITAL_PRESTADO_NUMERO}}) (en adelante, el “</w:t>
       </w:r>
       <w:r>
         <w:rPr>
@@ -612,7 +612,7 @@
           <w:highlight w:val="yellow"/>
           <w:rtl w:val="0"/>
         </w:rPr>
-        <w:t xml:space="preserve">[__]</w:t>
+        <w:t xml:space="preserve">{{TASA_NOMINAL_ANUAL}}</w:t>
       </w:r>
       <w:r>
         <w:rPr>
@@ -654,7 +654,7 @@
           <w:highlight w:val="yellow"/>
           <w:rtl w:val="0"/>
         </w:rPr>
-        <w:t xml:space="preserve">[__]</w:t>
+        <w:t xml:space="preserve">{{CANTIDAD_CUOTAS}}</w:t>
       </w:r>
       <w:r>
         <w:rPr>
@@ -818,7 +818,7 @@
           <w:highlight w:val="yellow"/>
           <w:rtl w:val="0"/>
         </w:rPr>
-        <w:t xml:space="preserve">[__]</w:t>
+        <w:t xml:space="preserve">{{TASA_MORATORIA_ANUAL}}</w:t>
       </w:r>
       <w:r>
         <w:rPr>
@@ -2089,7 +2089,7 @@
           <w:highlight w:val="yellow"/>
           <w:rtl w:val="0"/>
         </w:rPr>
-        <w:t xml:space="preserve">[NOMBRE DEL FIRMANTE]</w:t>
+        <w:t xml:space="preserve">{{FIRMANTE_NOMBRE}}</w:t>
       </w:r>
       <w:r>
         <w:rPr>
@@ -2112,7 +2112,7 @@
           <w:highlight w:val="yellow"/>
           <w:rtl w:val="0"/>
         </w:rPr>
-        <w:t xml:space="preserve">[NOMBRE DEL FIRMANTE]</w:t>
+        <w:t xml:space="preserve">{{FIRMANTE_NOMBRE}}</w:t>
       </w:r>
       <w:r>
         <w:rPr>
@@ -2143,7 +2143,7 @@
           <w:highlight w:val="yellow"/>
           <w:rtl w:val="0"/>
         </w:rPr>
-        <w:t xml:space="preserve">[DNI DEL FIRMANTE]</w:t>
+        <w:t xml:space="preserve">{{FIRMANTE_DNI}}</w:t>
       </w:r>
       <w:r>
         <w:rPr>
@@ -2165,7 +2165,7 @@
           <w:highlight w:val="yellow"/>
           <w:rtl w:val="0"/>
         </w:rPr>
-        <w:t xml:space="preserve">[DNI DEL FIRMANTE]</w:t>
+        <w:t xml:space="preserve">{{FIRMANTE_DNI}}</w:t>
       </w:r>
     </w:p>
     <w:p>

</xml_diff>